<commit_message>
Update docs to version 1.2
</commit_message>
<xml_diff>
--- a/Standard Capital - Form of Standard Capital Series A Term Sheet.docx
+++ b/Standard Capital - Form of Standard Capital Series A Term Sheet.docx
@@ -608,23 +608,7 @@
                 <w:sz w:val="22"/>
                 <w:szCs w:val="22"/>
               </w:rPr>
-              <w:t xml:space="preserve">qualification of the shares under applicable </w:t>
-            </w:r>
-            <w:proofErr w:type="gramStart"/>
-            <w:r>
-              <w:rPr>
-                <w:sz w:val="22"/>
-                <w:szCs w:val="22"/>
-              </w:rPr>
-              <w:t>Blue Sky</w:t>
-            </w:r>
-            <w:proofErr w:type="gramEnd"/>
-            <w:r>
-              <w:rPr>
-                <w:sz w:val="22"/>
-                <w:szCs w:val="22"/>
-              </w:rPr>
-              <w:t xml:space="preserve"> laws, </w:t>
+              <w:t xml:space="preserve">qualification of the shares under applicable Blue Sky laws, </w:t>
             </w:r>
             <w:r>
               <w:rPr>
@@ -891,7 +875,7 @@
                 <w:sz w:val="22"/>
                 <w:szCs w:val="22"/>
               </w:rPr>
-              <w:t xml:space="preserve">be determined </w:t>
+              <w:t xml:space="preserve">be determined on the basis of a </w:t>
             </w:r>
             <w:proofErr w:type="gramStart"/>
             <w:r>
@@ -899,7 +883,7 @@
                 <w:sz w:val="22"/>
                 <w:szCs w:val="22"/>
               </w:rPr>
-              <w:t>on the basis of</w:t>
+              <w:t>fully-diluted</w:t>
             </w:r>
             <w:proofErr w:type="gramEnd"/>
             <w:r>
@@ -907,7 +891,7 @@
                 <w:sz w:val="22"/>
                 <w:szCs w:val="22"/>
               </w:rPr>
-              <w:t xml:space="preserve"> a fully-diluted </w:t>
+              <w:t xml:space="preserve"> </w:t>
             </w:r>
             <w:r>
               <w:rPr>
@@ -956,15 +940,7 @@
                 <w:sz w:val="22"/>
                 <w:szCs w:val="22"/>
               </w:rPr>
-              <w:t xml:space="preserve"> an unallocated and </w:t>
-            </w:r>
-            <w:r>
-              <w:rPr>
-                <w:sz w:val="22"/>
-                <w:szCs w:val="22"/>
-              </w:rPr>
-              <w:lastRenderedPageBreak/>
-              <w:t xml:space="preserve">uncommitted employee option pool representing </w:t>
+              <w:t xml:space="preserve"> an unallocated and uncommitted employee option pool representing </w:t>
             </w:r>
             <w:r>
               <w:rPr>
@@ -1016,7 +992,24 @@
                 <w:sz w:val="22"/>
                 <w:szCs w:val="22"/>
               </w:rPr>
-              <w:t>For the avoidance of doubt, Standard Capital shall hold 10% of the Company on a fully-diluted basis following the Closing.</w:t>
+              <w:lastRenderedPageBreak/>
+              <w:t xml:space="preserve">For the avoidance of doubt, Standard Capital shall hold 10% of the Company on a </w:t>
+            </w:r>
+            <w:proofErr w:type="gramStart"/>
+            <w:r>
+              <w:rPr>
+                <w:sz w:val="22"/>
+                <w:szCs w:val="22"/>
+              </w:rPr>
+              <w:t>fully-diluted</w:t>
+            </w:r>
+            <w:proofErr w:type="gramEnd"/>
+            <w:r>
+              <w:rPr>
+                <w:sz w:val="22"/>
+                <w:szCs w:val="22"/>
+              </w:rPr>
+              <w:t xml:space="preserve"> basis following the Closing.</w:t>
             </w:r>
           </w:p>
         </w:tc>
@@ -1124,7 +1117,23 @@
                 <w:sz w:val="22"/>
                 <w:szCs w:val="22"/>
               </w:rPr>
-              <w:t xml:space="preserve"> on the Series A Preferred </w:t>
+              <w:t xml:space="preserve"> on </w:t>
+            </w:r>
+            <w:proofErr w:type="gramStart"/>
+            <w:r>
+              <w:rPr>
+                <w:sz w:val="22"/>
+                <w:szCs w:val="22"/>
+              </w:rPr>
+              <w:t>the Series</w:t>
+            </w:r>
+            <w:proofErr w:type="gramEnd"/>
+            <w:r>
+              <w:rPr>
+                <w:sz w:val="22"/>
+                <w:szCs w:val="22"/>
+              </w:rPr>
+              <w:t xml:space="preserve"> A Preferred </w:t>
             </w:r>
             <w:r>
               <w:rPr>
@@ -1260,7 +1269,23 @@
                 <w:sz w:val="22"/>
                 <w:szCs w:val="22"/>
               </w:rPr>
-              <w:t xml:space="preserve">declared and unpaid dividends on each share of Series A Preferred (or, if greater, the amount that the Series A Preferred would receive on an as-converted basis).  The balance of any proceeds </w:t>
+              <w:t xml:space="preserve">declared and unpaid dividends on each share of Series A Preferred (or, if greater, the amount that </w:t>
+            </w:r>
+            <w:proofErr w:type="gramStart"/>
+            <w:r>
+              <w:rPr>
+                <w:sz w:val="22"/>
+                <w:szCs w:val="22"/>
+              </w:rPr>
+              <w:t>the Series</w:t>
+            </w:r>
+            <w:proofErr w:type="gramEnd"/>
+            <w:r>
+              <w:rPr>
+                <w:sz w:val="22"/>
+                <w:szCs w:val="22"/>
+              </w:rPr>
+              <w:t xml:space="preserve"> A Preferred would receive on an as-converted basis).  The balance of any proceeds </w:t>
             </w:r>
             <w:r>
               <w:rPr>
@@ -1593,7 +1618,29 @@
                 <w:szCs w:val="22"/>
               </w:rPr>
               <w:noBreakHyphen/>
-              <w:t xml:space="preserve">up the affairs of the Company or effect any Deemed Liquidation Event; (ii) amend, alter, or repeal any provision of the Charter or Bylaws in a manner adverse to the </w:t>
+              <w:t>up the affairs of the Company or effect any Deemed Liquidation Event; (ii) amend, alter, or repeal any provision of the Charter or Bylaws in a manner adverse to the Series A Preferred Stock</w:t>
+            </w:r>
+            <w:r>
+              <w:rPr>
+                <w:sz w:val="22"/>
+                <w:szCs w:val="22"/>
+              </w:rPr>
+              <w:t>;</w:t>
+            </w:r>
+            <w:r>
+              <w:rPr>
+                <w:sz w:val="22"/>
+                <w:szCs w:val="22"/>
+                <w:vertAlign w:val="superscript"/>
+              </w:rPr>
+              <w:t xml:space="preserve"> </w:t>
+            </w:r>
+            <w:r>
+              <w:rPr>
+                <w:sz w:val="22"/>
+                <w:szCs w:val="22"/>
+              </w:rPr>
+              <w:t xml:space="preserve">(iii) create or authorize the creation of or issue any other security convertible into or exercisable for any equity security unless the same ranks junior to the Series A </w:t>
             </w:r>
             <w:r>
               <w:rPr>
@@ -1601,7 +1648,28 @@
                 <w:szCs w:val="22"/>
               </w:rPr>
               <w:lastRenderedPageBreak/>
-              <w:t>Series A Preferred Stock</w:t>
+              <w:t>Preferred with respect to its rights, preferences and privileges</w:t>
+            </w:r>
+            <w:r>
+              <w:rPr>
+                <w:sz w:val="22"/>
+                <w:szCs w:val="22"/>
+              </w:rPr>
+              <w:t>[</w:t>
+            </w:r>
+            <w:r>
+              <w:rPr>
+                <w:sz w:val="22"/>
+                <w:szCs w:val="22"/>
+              </w:rPr>
+              <w:t>, or increase the authorized number of shares of Series A Preferred</w:t>
+            </w:r>
+            <w:r>
+              <w:rPr>
+                <w:sz w:val="22"/>
+                <w:szCs w:val="22"/>
+              </w:rPr>
+              <w:t>]</w:t>
             </w:r>
             <w:r>
               <w:rPr>
@@ -1612,18 +1680,17 @@
             </w:r>
             <w:r>
               <w:rPr>
-                <w:sz w:val="22"/>
-                <w:szCs w:val="22"/>
-                <w:vertAlign w:val="superscript"/>
-              </w:rPr>
-              <w:t xml:space="preserve"> </w:t>
-            </w:r>
-            <w:r>
-              <w:rPr>
-                <w:sz w:val="22"/>
-                <w:szCs w:val="22"/>
-              </w:rPr>
-              <w:t>(iii) create or authorize the creation of or issue any other security convertible into or exercisable for any equity security unless the same ranks junior to the Series A Preferred with respect to its rights, preferences and privileges, or increase the authorized number of shares of Series A Preferred; (iv) sell, issue, sponsor, create or distribute any digital tokens, cryptocurrency or other blockchain-based assets; (v) purchase or redeem or pay any dividend on any capital stock prior to the Series A Preferred, other than stock repurchased at cost from former employees and consultants in connection with the cessation of their service; (vi) adopt, amend, terminate or repeal any equity (or equity-linked) compensation plan; (vii) create or authorize the creation of any debt security, if the aggregate indebtedness of the Corporation and its subsidiaries for borrowed money following such action would exceed $</w:t>
+                <w:rStyle w:val="FootnoteReference"/>
+                <w:szCs w:val="22"/>
+              </w:rPr>
+              <w:footnoteReference w:id="1"/>
+            </w:r>
+            <w:r>
+              <w:rPr>
+                <w:sz w:val="22"/>
+                <w:szCs w:val="22"/>
+              </w:rPr>
+              <w:t xml:space="preserve"> (iv) sell, issue, sponsor, create or distribute any digital tokens, cryptocurrency or other blockchain-based assets; (v) purchase or redeem or pay any dividend on any capital stock prior to the Series A Preferred, other than stock repurchased at cost from former employees and consultants in connection with the cessation of their service; (vi) adopt, amend, terminate or repeal any equity (or equity-linked) compensation plan; (vii) create or authorize the creation of any debt security, if the aggregate indebtedness of the Corporation and its subsidiaries for borrowed money following such action would exceed $</w:t>
             </w:r>
             <w:r>
               <w:rPr>
@@ -1988,7 +2055,15 @@
                 <w:sz w:val="22"/>
                 <w:szCs w:val="22"/>
               </w:rPr>
-              <w:t>Each share of Series A Preferred will automatically be converted into Common Stock at the then applicable conversion rate in the event of the closing of a firm commitment underwritten public offering with gross proceeds to the Company of not less than $</w:t>
+              <w:t xml:space="preserve">Each share of Series A Preferred will automatically be converted into Common Stock at the then applicable conversion rate in the event of the closing of a firm commitment underwritten public offering with </w:t>
+            </w:r>
+            <w:r>
+              <w:rPr>
+                <w:sz w:val="22"/>
+                <w:szCs w:val="22"/>
+              </w:rPr>
+              <w:lastRenderedPageBreak/>
+              <w:t>gross proceeds to the Company of not less than $</w:t>
             </w:r>
             <w:r>
               <w:rPr>
@@ -2048,6 +2123,7 @@
                 <w:sz w:val="22"/>
                 <w:szCs w:val="22"/>
               </w:rPr>
+              <w:lastRenderedPageBreak/>
               <w:t xml:space="preserve">STOCK PURCHASE </w:t>
             </w:r>
           </w:p>
@@ -2217,7 +2293,23 @@
                 <w:sz w:val="22"/>
                 <w:szCs w:val="22"/>
               </w:rPr>
-              <w:t xml:space="preserve">Standard representations and warranties by the Company customary for its size and industry.  </w:t>
+              <w:t xml:space="preserve">Standard representations and warranties by the Company </w:t>
+            </w:r>
+            <w:proofErr w:type="gramStart"/>
+            <w:r>
+              <w:rPr>
+                <w:sz w:val="22"/>
+                <w:szCs w:val="22"/>
+              </w:rPr>
+              <w:t>customary</w:t>
+            </w:r>
+            <w:proofErr w:type="gramEnd"/>
+            <w:r>
+              <w:rPr>
+                <w:sz w:val="22"/>
+                <w:szCs w:val="22"/>
+              </w:rPr>
+              <w:t xml:space="preserve"> for its size and industry.  </w:t>
             </w:r>
           </w:p>
         </w:tc>
@@ -2673,6 +2765,7 @@
                 <w:sz w:val="22"/>
                 <w:szCs w:val="22"/>
               </w:rPr>
+              <w:lastRenderedPageBreak/>
               <w:t>Non-Disclosure and Developments Agreement:</w:t>
             </w:r>
           </w:p>
@@ -2871,7 +2964,23 @@
                 <w:sz w:val="22"/>
                 <w:szCs w:val="22"/>
               </w:rPr>
-              <w:t xml:space="preserve">The Company bylaws and/or Restricted Stock Purchase Agreements </w:t>
+              <w:t xml:space="preserve">The Company </w:t>
+            </w:r>
+            <w:proofErr w:type="gramStart"/>
+            <w:r>
+              <w:rPr>
+                <w:sz w:val="22"/>
+                <w:szCs w:val="22"/>
+              </w:rPr>
+              <w:t>bylaws</w:t>
+            </w:r>
+            <w:proofErr w:type="gramEnd"/>
+            <w:r>
+              <w:rPr>
+                <w:sz w:val="22"/>
+                <w:szCs w:val="22"/>
+              </w:rPr>
+              <w:t xml:space="preserve"> and Restricted Stock Purchase Agreements </w:t>
             </w:r>
             <w:r>
               <w:rPr>
@@ -3015,7 +3124,23 @@
                 <w:sz w:val="22"/>
                 <w:szCs w:val="22"/>
               </w:rPr>
-              <w:t>provided that no portion of any Founder’s equity will be subject to single-trigger vesting acceleration upon a Deemed Liquidation Event.</w:t>
+              <w:t xml:space="preserve">provided that no portion of any Founder’s equity will be subject to </w:t>
+            </w:r>
+            <w:proofErr w:type="gramStart"/>
+            <w:r>
+              <w:rPr>
+                <w:sz w:val="22"/>
+                <w:szCs w:val="22"/>
+              </w:rPr>
+              <w:t>single-trigger</w:t>
+            </w:r>
+            <w:proofErr w:type="gramEnd"/>
+            <w:r>
+              <w:rPr>
+                <w:sz w:val="22"/>
+                <w:szCs w:val="22"/>
+              </w:rPr>
+              <w:t xml:space="preserve"> vesting acceleration upon a Deemed Liquidation Event.</w:t>
             </w:r>
           </w:p>
         </w:tc>
@@ -3396,12 +3521,21 @@
           <w:szCs w:val="22"/>
         </w:rPr>
       </w:pPr>
-      <w:r>
-        <w:rPr>
-          <w:sz w:val="22"/>
-          <w:szCs w:val="22"/>
-        </w:rPr>
-        <w:t>By:</w:t>
+      <w:proofErr w:type="gramStart"/>
+      <w:r>
+        <w:rPr>
+          <w:sz w:val="22"/>
+          <w:szCs w:val="22"/>
+        </w:rPr>
+        <w:t>By</w:t>
+      </w:r>
+      <w:proofErr w:type="gramEnd"/>
+      <w:r>
+        <w:rPr>
+          <w:sz w:val="22"/>
+          <w:szCs w:val="22"/>
+        </w:rPr>
+        <w:t>:</w:t>
       </w:r>
       <w:r>
         <w:rPr>
@@ -3535,12 +3669,21 @@
           <w:szCs w:val="22"/>
         </w:rPr>
       </w:pPr>
-      <w:r>
-        <w:rPr>
-          <w:sz w:val="22"/>
-          <w:szCs w:val="22"/>
-        </w:rPr>
-        <w:t>By:</w:t>
+      <w:proofErr w:type="gramStart"/>
+      <w:r>
+        <w:rPr>
+          <w:sz w:val="22"/>
+          <w:szCs w:val="22"/>
+        </w:rPr>
+        <w:t>By</w:t>
+      </w:r>
+      <w:proofErr w:type="gramEnd"/>
+      <w:r>
+        <w:rPr>
+          <w:sz w:val="22"/>
+          <w:szCs w:val="22"/>
+        </w:rPr>
+        <w:t>:</w:t>
       </w:r>
       <w:r>
         <w:rPr>
@@ -3763,12 +3906,12 @@
       <w:rPr>
         <w:noProof/>
       </w:rPr>
-      <w:pict w14:anchorId="49647599">
+      <w:pict w14:anchorId="798FF9A5">
         <v:shapetype id="_x0000_t202" coordsize="21600,21600" o:spt="202" path="m,l,21600r21600,l21600,xe">
           <v:stroke joinstyle="miter"/>
           <v:path gradientshapeok="t" o:connecttype="rect"/>
         </v:shapetype>
-        <v:shape id="zzmpTrailer_8523_19" o:spid="_x0000_s1033" type="#_x0000_t202" style="position:absolute;margin-left:0;margin-top:0;width:201.6pt;height:20.15pt;z-index:251659264;visibility:visible;mso-wrap-style:square;mso-width-percent:0;mso-height-percent:0;mso-wrap-distance-left:9pt;mso-wrap-distance-top:0;mso-wrap-distance-right:9pt;mso-wrap-distance-bottom:0;mso-position-horizontal:absolute;mso-position-horizontal-relative:margin;mso-position-vertical:absolute;mso-position-vertical-relative:text;mso-width-percent:0;mso-height-percent:0;mso-width-relative:page;mso-height-relative:page;v-text-anchor:top" o:gfxdata="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" filled="f" stroked="f">
+        <v:shape id="zzmpTrailer_8523_19" o:spid="_x0000_s1037" type="#_x0000_t202" style="position:absolute;margin-left:0;margin-top:0;width:201.6pt;height:20.15pt;z-index:251658240;visibility:visible;mso-wrap-style:square;mso-width-percent:0;mso-height-percent:0;mso-wrap-distance-left:9pt;mso-wrap-distance-top:0;mso-wrap-distance-right:9pt;mso-wrap-distance-bottom:0;mso-position-horizontal:absolute;mso-position-horizontal-relative:margin;mso-position-vertical:absolute;mso-position-vertical-relative:text;mso-width-percent:0;mso-height-percent:0;mso-width-relative:page;mso-height-relative:page;v-text-anchor:top" o:gfxdata="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" filled="f" stroked="f">
           <v:textbox inset="0,0,0,0">
             <w:txbxContent>
               <w:p>
@@ -3776,7 +3919,7 @@
                   <w:pStyle w:val="MacPacTrailer"/>
                 </w:pPr>
                 <w:r>
-                  <w:t xml:space="preserve">MOFO-358283900 </w:t>
+                  <w:t xml:space="preserve">MF-365774563 </w:t>
                 </w:r>
               </w:p>
             </w:txbxContent>
@@ -3850,12 +3993,12 @@
       <w:rPr>
         <w:noProof/>
       </w:rPr>
-      <w:pict w14:anchorId="2E28E22B">
+      <w:pict w14:anchorId="6CCEB273">
         <v:shapetype id="_x0000_t202" coordsize="21600,21600" o:spt="202" path="m,l,21600r21600,l21600,xe">
           <v:stroke joinstyle="miter"/>
           <v:path gradientshapeok="t" o:connecttype="rect"/>
         </v:shapetype>
-        <v:shape id="zzmpTrailer_8523_1B" o:spid="_x0000_s1034" type="#_x0000_t202" style="position:absolute;margin-left:0;margin-top:0;width:201.6pt;height:20.15pt;z-index:251661312;visibility:visible;mso-wrap-style:square;mso-width-percent:0;mso-height-percent:0;mso-wrap-distance-left:9pt;mso-wrap-distance-top:0;mso-wrap-distance-right:9pt;mso-wrap-distance-bottom:0;mso-position-horizontal:absolute;mso-position-horizontal-relative:margin;mso-position-vertical:absolute;mso-position-vertical-relative:text;mso-width-percent:0;mso-height-percent:0;mso-width-relative:page;mso-height-relative:page;v-text-anchor:top" o:gfxdata="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" filled="f" stroked="f">
+        <v:shape id="zzmpTrailer_8523_1B" o:spid="_x0000_s1038" type="#_x0000_t202" style="position:absolute;margin-left:0;margin-top:0;width:201.6pt;height:20.15pt;z-index:251658240;visibility:visible;mso-wrap-style:square;mso-width-percent:0;mso-height-percent:0;mso-wrap-distance-left:9pt;mso-wrap-distance-top:0;mso-wrap-distance-right:9pt;mso-wrap-distance-bottom:0;mso-position-horizontal:absolute;mso-position-horizontal-relative:margin;mso-position-vertical:absolute;mso-position-vertical-relative:text;mso-width-percent:0;mso-height-percent:0;mso-width-relative:page;mso-height-relative:page;v-text-anchor:top" o:gfxdata="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" filled="f" stroked="f">
           <v:textbox inset="0,0,0,0">
             <w:txbxContent>
               <w:p>
@@ -3863,7 +4006,7 @@
                   <w:pStyle w:val="MacPacTrailer"/>
                 </w:pPr>
                 <w:r>
-                  <w:t xml:space="preserve">MOFO-358283900 </w:t>
+                  <w:t xml:space="preserve">MF-365774563 </w:t>
                 </w:r>
               </w:p>
             </w:txbxContent>
@@ -3940,7 +4083,7 @@
       <mc:AlternateContent>
         <mc:Choice Requires="wps">
           <w:drawing>
-            <wp:anchor distT="0" distB="0" distL="114300" distR="114300" simplePos="0" relativeHeight="251663360" behindDoc="0" locked="0" layoutInCell="1" allowOverlap="1" wp14:anchorId="5558BDC7" wp14:editId="48756CBC">
+            <wp:anchor distT="0" distB="0" distL="114300" distR="114300" simplePos="0" relativeHeight="251660288" behindDoc="0" locked="0" layoutInCell="1" allowOverlap="1" wp14:anchorId="1AEF1882" wp14:editId="618BE19B">
               <wp:simplePos x="0" y="0"/>
               <wp:positionH relativeFrom="margin">
                 <wp:posOffset>0</wp:posOffset>
@@ -3951,7 +4094,7 @@
               <wp:extent cx="2560320" cy="255905"/>
               <wp:effectExtent l="0" t="0" r="11430" b="10795"/>
               <wp:wrapNone/>
-              <wp:docPr id="1504166034" name="zzmpTrailer_8523_29"/>
+              <wp:docPr id="152561388" name="zzmpTrailer_8523_29"/>
               <wp:cNvGraphicFramePr>
                 <a:graphicFrameLocks xmlns:a="http://schemas.openxmlformats.org/drawingml/2006/main"/>
               </wp:cNvGraphicFramePr>
@@ -3981,7 +4124,7 @@
                             <w:pStyle w:val="MacPacTrailer"/>
                           </w:pPr>
                           <w:r>
-                            <w:t xml:space="preserve">MOFO-358283900 </w:t>
+                            <w:t xml:space="preserve">MF-365774563 </w:t>
                           </w:r>
                         </w:p>
                       </w:txbxContent>
@@ -4001,13 +4144,13 @@
             </wp:anchor>
           </w:drawing>
         </mc:Choice>
-        <mc:Fallback xmlns="">
+        <mc:Fallback>
           <w:pict>
-            <v:shapetype w14:anchorId="5558BDC7" id="_x0000_t202" coordsize="21600,21600" o:spt="202" path="m,l,21600r21600,l21600,xe">
+            <v:shapetype w14:anchorId="1AEF1882" id="_x0000_t202" coordsize="21600,21600" o:spt="202" path="m,l,21600r21600,l21600,xe">
               <v:stroke joinstyle="miter"/>
               <v:path gradientshapeok="t" o:connecttype="rect"/>
             </v:shapetype>
-            <v:shape id="zzmpTrailer_8523_29" o:spid="_x0000_s1026" type="#_x0000_t202" style="position:absolute;margin-left:0;margin-top:0;width:201.6pt;height:20.15pt;z-index:251663360;visibility:visible;mso-wrap-style:square;mso-width-percent:0;mso-height-percent:0;mso-wrap-distance-left:9pt;mso-wrap-distance-top:0;mso-wrap-distance-right:9pt;mso-wrap-distance-bottom:0;mso-position-horizontal:absolute;mso-position-horizontal-relative:margin;mso-position-vertical:absolute;mso-position-vertical-relative:text;mso-width-percent:0;mso-height-percent:0;mso-width-relative:page;mso-height-relative:page;v-text-anchor:top" o:gfxdata="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" filled="f" stroked="f">
+            <v:shape id="zzmpTrailer_8523_29" o:spid="_x0000_s1026" type="#_x0000_t202" style="position:absolute;margin-left:0;margin-top:0;width:201.6pt;height:20.15pt;z-index:251660288;visibility:visible;mso-wrap-style:square;mso-width-percent:0;mso-height-percent:0;mso-wrap-distance-left:9pt;mso-wrap-distance-top:0;mso-wrap-distance-right:9pt;mso-wrap-distance-bottom:0;mso-position-horizontal:absolute;mso-position-horizontal-relative:margin;mso-position-vertical:absolute;mso-position-vertical-relative:text;mso-width-percent:0;mso-height-percent:0;mso-width-relative:page;mso-height-relative:page;v-text-anchor:top" o:gfxdata="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" filled="f" stroked="f">
               <v:textbox inset="0,0,0,0">
                 <w:txbxContent>
                   <w:p>
@@ -4015,7 +4158,7 @@
                       <w:pStyle w:val="MacPacTrailer"/>
                     </w:pPr>
                     <w:r>
-                      <w:t xml:space="preserve">MOFO-358283900 </w:t>
+                      <w:t xml:space="preserve">MF-365774563 </w:t>
                     </w:r>
                   </w:p>
                 </w:txbxContent>
@@ -4043,6 +4186,54 @@
     <w:p>
       <w:r>
         <w:continuationSeparator/>
+      </w:r>
+    </w:p>
+  </w:footnote>
+  <w:footnote w:id="1">
+    <w:p>
+      <w:pPr>
+        <w:pStyle w:val="FootnoteText"/>
+      </w:pPr>
+      <w:r>
+        <w:rPr>
+          <w:rStyle w:val="FootnoteReference"/>
+        </w:rPr>
+        <w:footnoteRef/>
+      </w:r>
+      <w:r>
+        <w:t xml:space="preserve"> </w:t>
+      </w:r>
+      <w:r>
+        <w:rPr>
+          <w:u w:val="single"/>
+        </w:rPr>
+        <w:t>Note to Draft</w:t>
+      </w:r>
+      <w:r>
+        <w:t xml:space="preserve">: </w:t>
+      </w:r>
+      <w:r>
+        <w:t xml:space="preserve">To be included unless the Shadow Series </w:t>
+      </w:r>
+      <w:r>
+        <w:t xml:space="preserve">will </w:t>
+      </w:r>
+      <w:r>
+        <w:t xml:space="preserve">form </w:t>
+      </w:r>
+      <w:proofErr w:type="gramStart"/>
+      <w:r>
+        <w:t>a majority of</w:t>
+      </w:r>
+      <w:proofErr w:type="gramEnd"/>
+      <w:r>
+        <w:t xml:space="preserve"> the</w:t>
+      </w:r>
+      <w:r>
+        <w:t xml:space="preserve"> Preferred Stock.</w:t>
+      </w:r>
+      <w:r>
+        <w:t xml:space="preserve"> Subject to review of pro forma.</w:t>
       </w:r>
     </w:p>
   </w:footnote>
@@ -4099,7 +4290,7 @@
         <w:sz w:val="22"/>
         <w:szCs w:val="22"/>
       </w:rPr>
-      <w:t>1</w:t>
+      <w:t>2</w:t>
     </w:r>
   </w:p>
   <w:p>
@@ -4151,7 +4342,27 @@
         <w:sz w:val="22"/>
         <w:szCs w:val="22"/>
       </w:rPr>
-      <w:t xml:space="preserve"> agreements designed to facilitate a simplified transaction process.  We reserve the right to modify terms and/or these forms, but we generally do not accept comments or revisions to the standardized provisions. We will consider modifications only in exceptional circumstances where there are compelling business, legal, or regulatory reasons that require deviation from our standard terms, and any requested changes must be accompanied by a detailed explanation of the specific rationale and business necessity.</w:t>
+      <w:t xml:space="preserve"> agreements designed to facilitate a simplified transaction process.  We reserve the right to modify terms and/or these forms, but we generally do not accept comments or revisions to the standardized provisions. We will consider modifications only in exceptional circumstances where there </w:t>
+    </w:r>
+    <w:proofErr w:type="gramStart"/>
+    <w:r>
+      <w:rPr>
+        <w:i/>
+        <w:iCs/>
+        <w:sz w:val="22"/>
+        <w:szCs w:val="22"/>
+      </w:rPr>
+      <w:t>are</w:t>
+    </w:r>
+    <w:proofErr w:type="gramEnd"/>
+    <w:r>
+      <w:rPr>
+        <w:i/>
+        <w:iCs/>
+        <w:sz w:val="22"/>
+        <w:szCs w:val="22"/>
+      </w:rPr>
+      <w:t xml:space="preserve"> compelling business, legal, or regulatory reasons that require deviation from our standard terms, and any requested changes must be accompanied by a detailed explanation of the specific rationale and business necessity.</w:t>
     </w:r>
   </w:p>
 </w:hdr>
@@ -4680,7 +4891,7 @@
   </w:style>
   <w:style w:type="paragraph" w:customStyle="1" w:styleId="MacPacTrailer">
     <w:name w:val="MacPac Trailer"/>
-    <w:rsid w:val="00F46ED6"/>
+    <w:rsid w:val="00D53AC8"/>
     <w:pPr>
       <w:widowControl w:val="0"/>
       <w:spacing w:line="200" w:lineRule="exact"/>

</xml_diff>